<commit_message>
Remove residual '40' framing from hub + economics cards; walkthrough doc with explicit click-path
</commit_message>
<xml_diff>
--- a/deliverables/poc_walkthrough_external.docx
+++ b/deliverables/poc_walkthrough_external.docx
@@ -64,6 +64,252 @@
     </w:p>
     <w:p>
       <w:pPr>
+        <w:spacing w:after="100"/>
+      </w:pPr>
+      <w:r>
+        <w:rPr>
+          <w:b/>
+          <w:color w:val="1E3A5F"/>
+        </w:rPr>
+        <w:t xml:space="preserve">➤ Navigate:  </w:t>
+      </w:r>
+      <w:r>
+        <w:rPr>
+          <w:b/>
+        </w:rPr>
+        <w:t>Open the demonstration link in a browser, enter the access password, and click “Enter POC.” You’ll arrive on the Hub — the home screen with a grid of cards on the left and one large “Launch POC” card on the right. Start every stop below from the Hub.</w:t>
+      </w:r>
+    </w:p>
+    <w:p>
+      <w:pPr>
+        <w:spacing w:before="280" w:after="80"/>
+      </w:pPr>
+      <w:r>
+        <w:rPr>
+          <w:b/>
+          <w:color w:val="1E3A5F"/>
+          <w:sz w:val="26"/>
+        </w:rPr>
+        <w:t>Click-path at a glance</w:t>
+      </w:r>
+    </w:p>
+    <w:tbl>
+      <w:tblPr>
+        <w:tblStyle w:val="LightGrid-Accent1"/>
+        <w:tblW w:type="auto" w:w="0"/>
+        <w:tblLook w:firstColumn="1" w:firstRow="1" w:lastColumn="0" w:lastRow="0" w:noHBand="0" w:noVBand="1" w:val="04A0"/>
+      </w:tblPr>
+      <w:tblGrid>
+        <w:gridCol w:w="4320"/>
+        <w:gridCol w:w="4320"/>
+      </w:tblGrid>
+      <w:tr>
+        <w:tc>
+          <w:tcPr>
+            <w:tcW w:type="dxa" w:w="4320"/>
+          </w:tcPr>
+          <w:p>
+            <w:r>
+              <w:rPr>
+                <w:b/>
+              </w:rPr>
+              <w:t>Stop</w:t>
+            </w:r>
+          </w:p>
+        </w:tc>
+        <w:tc>
+          <w:tcPr>
+            <w:tcW w:type="dxa" w:w="4320"/>
+          </w:tcPr>
+          <w:p>
+            <w:r>
+              <w:rPr>
+                <w:b/>
+              </w:rPr>
+              <w:t>Where to click</w:t>
+            </w:r>
+          </w:p>
+        </w:tc>
+      </w:tr>
+      <w:tr>
+        <w:tc>
+          <w:tcPr>
+            <w:tcW w:type="dxa" w:w="4320"/>
+          </w:tcPr>
+          <w:p>
+            <w:r>
+              <w:t>1–2</w:t>
+            </w:r>
+          </w:p>
+        </w:tc>
+        <w:tc>
+          <w:tcPr>
+            <w:tcW w:type="dxa" w:w="4320"/>
+          </w:tcPr>
+          <w:p>
+            <w:r>
+              <w:t>Hub → click “8-Agent Value Chain” → back to Hub (top-left “Coastal DME”)</w:t>
+            </w:r>
+          </w:p>
+        </w:tc>
+      </w:tr>
+      <w:tr>
+        <w:tc>
+          <w:tcPr>
+            <w:tcW w:type="dxa" w:w="4320"/>
+          </w:tcPr>
+          <w:p>
+            <w:r>
+              <w:t>3</w:t>
+            </w:r>
+          </w:p>
+        </w:tc>
+        <w:tc>
+          <w:tcPr>
+            <w:tcW w:type="dxa" w:w="4320"/>
+          </w:tcPr>
+          <w:p>
+            <w:r>
+              <w:t>Hub → click “Launch POC” → click “Start Live Processing”</w:t>
+            </w:r>
+          </w:p>
+        </w:tc>
+      </w:tr>
+      <w:tr>
+        <w:tc>
+          <w:tcPr>
+            <w:tcW w:type="dxa" w:w="4320"/>
+          </w:tcPr>
+          <w:p>
+            <w:r>
+              <w:t>4</w:t>
+            </w:r>
+          </w:p>
+        </w:tc>
+        <w:tc>
+          <w:tcPr>
+            <w:tcW w:type="dxa" w:w="4320"/>
+          </w:tcPr>
+          <w:p>
+            <w:r>
+              <w:t>Click the highlighted James Holloway → step through with the “→” buttons (Step 1–7)</w:t>
+            </w:r>
+          </w:p>
+        </w:tc>
+      </w:tr>
+      <w:tr>
+        <w:tc>
+          <w:tcPr>
+            <w:tcW w:type="dxa" w:w="4320"/>
+          </w:tcPr>
+          <w:p>
+            <w:r>
+              <w:t>5</w:t>
+            </w:r>
+          </w:p>
+        </w:tc>
+        <w:tc>
+          <w:tcPr>
+            <w:tcW w:type="dxa" w:w="4320"/>
+          </w:tcPr>
+          <w:p>
+            <w:r>
+              <w:t>Step 05 Email → Step 06 Voice (call auto-places — answer on speaker)</w:t>
+            </w:r>
+          </w:p>
+        </w:tc>
+      </w:tr>
+      <w:tr>
+        <w:tc>
+          <w:tcPr>
+            <w:tcW w:type="dxa" w:w="4320"/>
+          </w:tcPr>
+          <w:p>
+            <w:r>
+              <w:t>6</w:t>
+            </w:r>
+          </w:p>
+        </w:tc>
+        <w:tc>
+          <w:tcPr>
+            <w:tcW w:type="dxa" w:w="4320"/>
+          </w:tcPr>
+          <w:p>
+            <w:r>
+              <w:t>Step 07 Route Output → back to Hub → “Observability Dashboard” → drill into episode</w:t>
+            </w:r>
+          </w:p>
+        </w:tc>
+      </w:tr>
+      <w:tr>
+        <w:tc>
+          <w:tcPr>
+            <w:tcW w:type="dxa" w:w="4320"/>
+          </w:tcPr>
+          <w:p>
+            <w:r>
+              <w:t>7</w:t>
+            </w:r>
+          </w:p>
+        </w:tc>
+        <w:tc>
+          <w:tcPr>
+            <w:tcW w:type="dxa" w:w="4320"/>
+          </w:tcPr>
+          <w:p>
+            <w:r>
+              <w:t>Hub → “Launch POC” → click “Receive New Fax”</w:t>
+            </w:r>
+          </w:p>
+        </w:tc>
+      </w:tr>
+      <w:tr>
+        <w:tc>
+          <w:tcPr>
+            <w:tcW w:type="dxa" w:w="4320"/>
+          </w:tcPr>
+          <w:p>
+            <w:r>
+              <w:t>8</w:t>
+            </w:r>
+          </w:p>
+        </w:tc>
+        <w:tc>
+          <w:tcPr>
+            <w:tcW w:type="dxa" w:w="4320"/>
+          </w:tcPr>
+          <w:p>
+            <w:r>
+              <w:t>Hub → “Scale &amp; Cost Calculator”</w:t>
+            </w:r>
+          </w:p>
+        </w:tc>
+      </w:tr>
+      <w:tr>
+        <w:tc>
+          <w:tcPr>
+            <w:tcW w:type="dxa" w:w="4320"/>
+          </w:tcPr>
+          <w:p>
+            <w:r>
+              <w:t>9</w:t>
+            </w:r>
+          </w:p>
+        </w:tc>
+        <w:tc>
+          <w:tcPr>
+            <w:tcW w:type="dxa" w:w="4320"/>
+          </w:tcPr>
+          <w:p>
+            <w:r>
+              <w:t>Hub → “Live Observability Dashboard” / “Referral Analytics” / “Coached Intake Simulator”</w:t>
+            </w:r>
+          </w:p>
+        </w:tc>
+      </w:tr>
+    </w:tbl>
+    <w:p>
+      <w:pPr>
         <w:spacing w:before="280" w:after="80"/>
       </w:pPr>
       <w:r>
@@ -73,6 +319,24 @@
           <w:sz w:val="30"/>
         </w:rPr>
         <w:t>1.  Opening — the problem in one breath</w:t>
+      </w:r>
+    </w:p>
+    <w:p>
+      <w:pPr>
+        <w:spacing w:after="100"/>
+      </w:pPr>
+      <w:r>
+        <w:rPr>
+          <w:b/>
+          <w:color w:val="1E3A5F"/>
+        </w:rPr>
+        <w:t xml:space="preserve">➤ Navigate:  </w:t>
+      </w:r>
+      <w:r>
+        <w:rPr>
+          <w:b/>
+        </w:rPr>
+        <w:t>Stay on the Hub for this opening. (Optional: click the “8-Agent Value Chain” card to show the bigger picture, then click the “Coastal DME” name at the top-left to come back.)</w:t>
       </w:r>
     </w:p>
     <w:p>
@@ -124,6 +388,24 @@
     </w:p>
     <w:p>
       <w:pPr>
+        <w:spacing w:after="100"/>
+      </w:pPr>
+      <w:r>
+        <w:rPr>
+          <w:b/>
+          <w:color w:val="1E3A5F"/>
+        </w:rPr>
+        <w:t xml:space="preserve">➤ Navigate:  </w:t>
+      </w:r>
+      <w:r>
+        <w:rPr>
+          <w:b/>
+        </w:rPr>
+        <w:t>On the Hub, click the “8-Agent Value Chain” card. After you’ve framed it, click the “Coastal DME” name at the top-left to return to the Hub.</w:t>
+      </w:r>
+    </w:p>
+    <w:p>
+      <w:pPr>
         <w:spacing w:after="80"/>
       </w:pPr>
       <w:r>
@@ -134,7 +416,7 @@
         <w:t xml:space="preserve">On screen:  </w:t>
       </w:r>
       <w:r>
-        <w:t>The launch hub, with its set of capability cards.</w:t>
+        <w:t>The eight-agent value chain — referral to payment — with Agent 1 (intake) built and live.</w:t>
       </w:r>
     </w:p>
     <w:p>
@@ -152,7 +434,7 @@
         <w:rPr>
           <w:i/>
         </w:rPr>
-        <w:t>“Everything launches from one place. The centerpiece is the live intake agent. Around it sit live operational metrics, an analytics layer, a scale-and-cost view, and a training module for new associates. We’ll spend most of our time in the live agent and come back to the rest.”</w:t>
+        <w:t>“Before we go live, here’s the bigger picture. The full workers’-comp operations cycle, referral to payment, is eight modular agents. What you’re about to see is the first one — intake — built and running today. The others are on the roadmap, each one deployable on its own inside your environment. So this isn’t a science project; it’s the first agent of a chain, live.”</w:t>
       </w:r>
     </w:p>
     <w:p>
@@ -166,6 +448,24 @@
           <w:sz w:val="30"/>
         </w:rPr>
         <w:t>3.  Live processing — watch it work</w:t>
+      </w:r>
+    </w:p>
+    <w:p>
+      <w:pPr>
+        <w:spacing w:after="100"/>
+      </w:pPr>
+      <w:r>
+        <w:rPr>
+          <w:b/>
+          <w:color w:val="1E3A5F"/>
+        </w:rPr>
+        <w:t xml:space="preserve">➤ Navigate:  </w:t>
+      </w:r>
+      <w:r>
+        <w:rPr>
+          <w:b/>
+        </w:rPr>
+        <w:t>On the Hub, click the large “Launch POC” card on the right (“Live Intake Agent POC”). On the live screen, click the green “Start Live Processing” button.</w:t>
       </w:r>
     </w:p>
     <w:p>
@@ -236,6 +536,24 @@
           <w:sz w:val="30"/>
         </w:rPr>
         <w:t>4.  Inside one referral — the “is it real?” moment</w:t>
+      </w:r>
+    </w:p>
+    <w:p>
+      <w:pPr>
+        <w:spacing w:after="100"/>
+      </w:pPr>
+      <w:r>
+        <w:rPr>
+          <w:b/>
+          <w:color w:val="1E3A5F"/>
+        </w:rPr>
+        <w:t xml:space="preserve">➤ Navigate:  </w:t>
+      </w:r>
+      <w:r>
+        <w:rPr>
+          <w:b/>
+        </w:rPr>
+        <w:t>As the queue runs, the James Holloway referral is highlighted — click it (or click “Open Pipeline” on his row) to open the full pipeline. Move through the steps with the “→” button at the bottom of each step (or the step tabs across the top): Step 1 through Step 7.</w:t>
       </w:r>
     </w:p>
     <w:p>
@@ -364,6 +682,24 @@
     </w:p>
     <w:p>
       <w:pPr>
+        <w:spacing w:after="100"/>
+      </w:pPr>
+      <w:r>
+        <w:rPr>
+          <w:b/>
+          <w:color w:val="1E3A5F"/>
+        </w:rPr>
+        <w:t xml:space="preserve">➤ Navigate:  </w:t>
+      </w:r>
+      <w:r>
+        <w:rPr>
+          <w:b/>
+        </w:rPr>
+        <w:t>Continue to “Step 05 — Email Outreach,” then to “Step 06 — Voice Outreach.” On Step 6 the call places itself automatically — have your phone ready and answer it on speaker.</w:t>
+      </w:r>
+    </w:p>
+    <w:p>
+      <w:pPr>
         <w:spacing w:after="80"/>
       </w:pPr>
       <w:r>
@@ -454,6 +790,24 @@
     </w:p>
     <w:p>
       <w:pPr>
+        <w:spacing w:after="100"/>
+      </w:pPr>
+      <w:r>
+        <w:rPr>
+          <w:b/>
+          <w:color w:val="1E3A5F"/>
+        </w:rPr>
+        <w:t xml:space="preserve">➤ Navigate:  </w:t>
+      </w:r>
+      <w:r>
+        <w:rPr>
+          <w:b/>
+        </w:rPr>
+        <w:t>Advance to “Step 07 — Route Output” to show the finished record. Then click the “Coastal DME” name at the top-left to return to the Hub, and open the “Observability Dashboard” card; drill into the episode to show its audit trail.</w:t>
+      </w:r>
+    </w:p>
+    <w:p>
+      <w:pPr>
         <w:spacing w:after="80"/>
       </w:pPr>
       <w:r>
@@ -534,6 +888,24 @@
     </w:p>
     <w:p>
       <w:pPr>
+        <w:spacing w:after="100"/>
+      </w:pPr>
+      <w:r>
+        <w:rPr>
+          <w:b/>
+          <w:color w:val="1E3A5F"/>
+        </w:rPr>
+        <w:t xml:space="preserve">➤ Navigate:  </w:t>
+      </w:r>
+      <w:r>
+        <w:rPr>
+          <w:b/>
+        </w:rPr>
+        <w:t>Return to the Hub and open the “Launch POC” card again (the live agent screen). Click the “Receive New Fax” button near the top to show the live intake fax number.</w:t>
+      </w:r>
+    </w:p>
+    <w:p>
+      <w:pPr>
         <w:spacing w:after="80"/>
       </w:pPr>
       <w:r>
@@ -584,6 +956,24 @@
           <w:sz w:val="30"/>
         </w:rPr>
         <w:t>8.  Scale and cost — the honest version</w:t>
+      </w:r>
+    </w:p>
+    <w:p>
+      <w:pPr>
+        <w:spacing w:after="100"/>
+      </w:pPr>
+      <w:r>
+        <w:rPr>
+          <w:b/>
+          <w:color w:val="1E3A5F"/>
+        </w:rPr>
+        <w:t xml:space="preserve">➤ Navigate:  </w:t>
+      </w:r>
+      <w:r>
+        <w:rPr>
+          <w:b/>
+        </w:rPr>
+        <w:t>Return to the Hub and click the “Scale &amp; Cost Calculator” card.</w:t>
       </w:r>
     </w:p>
     <w:p>
@@ -658,6 +1048,24 @@
     </w:p>
     <w:p>
       <w:pPr>
+        <w:spacing w:after="100"/>
+      </w:pPr>
+      <w:r>
+        <w:rPr>
+          <w:b/>
+          <w:color w:val="1E3A5F"/>
+        </w:rPr>
+        <w:t xml:space="preserve">➤ Navigate:  </w:t>
+      </w:r>
+      <w:r>
+        <w:rPr>
+          <w:b/>
+        </w:rPr>
+        <w:t>From the Hub, the “Live Observability Dashboard,” “Referral Analytics &amp; Insights,” and “Coached Intake Simulator” cards — open whichever the audience is most interested in.</w:t>
+      </w:r>
+    </w:p>
+    <w:p>
+      <w:pPr>
         <w:spacing w:after="80"/>
       </w:pPr>
       <w:r>
@@ -700,6 +1108,24 @@
           <w:sz w:val="30"/>
         </w:rPr>
         <w:t>10.  Closing</w:t>
+      </w:r>
+    </w:p>
+    <w:p>
+      <w:pPr>
+        <w:spacing w:after="100"/>
+      </w:pPr>
+      <w:r>
+        <w:rPr>
+          <w:b/>
+          <w:color w:val="1E3A5F"/>
+        </w:rPr>
+        <w:t xml:space="preserve">➤ Navigate:  </w:t>
+      </w:r>
+      <w:r>
+        <w:rPr>
+          <w:b/>
+        </w:rPr>
+        <w:t>Close from wherever you are — no navigation needed.</w:t>
       </w:r>
     </w:p>
     <w:p>

</xml_diff>